<commit_message>
Tweaked the ingestion script since i deleted new columns in our original datasets
</commit_message>
<xml_diff>
--- a/SQL SCRIPTS/Data WareHouse/Datawarehouse Architecture/DataWaeHouse Architecture2.docx
+++ b/SQL SCRIPTS/Data WareHouse/Datawarehouse Architecture/DataWaeHouse Architecture2.docx
@@ -1221,83 +1221,6 @@
         </w:rPr>
       </w:pPr>
     </w:p>
-    <w:tbl>
-      <w:tblPr>
-        <w:tblpPr w:leftFromText="180" w:rightFromText="180" w:vertAnchor="text" w:horzAnchor="page" w:tblpX="4483" w:tblpY="2313"/>
-        <w:tblW w:w="0" w:type="auto"/>
-        <w:tblBorders>
-          <w:top w:val="single" w:sz="4" w:space="0" w:color="auto"/>
-          <w:left w:val="single" w:sz="4" w:space="0" w:color="auto"/>
-          <w:bottom w:val="single" w:sz="4" w:space="0" w:color="auto"/>
-          <w:right w:val="single" w:sz="4" w:space="0" w:color="auto"/>
-          <w:insideH w:val="single" w:sz="4" w:space="0" w:color="auto"/>
-          <w:insideV w:val="single" w:sz="4" w:space="0" w:color="auto"/>
-        </w:tblBorders>
-        <w:tblLook w:val="0000" w:firstRow="0" w:lastRow="0" w:firstColumn="0" w:lastColumn="0" w:noHBand="0" w:noVBand="0"/>
-      </w:tblPr>
-      <w:tblGrid>
-        <w:gridCol w:w="983"/>
-        <w:gridCol w:w="817"/>
-      </w:tblGrid>
-      <w:tr>
-        <w:trPr>
-          <w:trHeight w:val="399"/>
-        </w:trPr>
-        <w:tc>
-          <w:tcPr>
-            <w:tcW w:w="1800" w:type="dxa"/>
-            <w:gridSpan w:val="2"/>
-          </w:tcPr>
-          <w:p>
-            <w:pPr>
-              <w:jc w:val="center"/>
-              <w:rPr>
-                <w:sz w:val="24"/>
-                <w:szCs w:val="24"/>
-              </w:rPr>
-            </w:pPr>
-            <w:r>
-              <w:rPr>
-                <w:sz w:val="24"/>
-                <w:szCs w:val="24"/>
-              </w:rPr>
-              <w:t>Age Group Dimension</w:t>
-            </w:r>
-          </w:p>
-        </w:tc>
-      </w:tr>
-      <w:tr>
-        <w:trPr>
-          <w:trHeight w:val="295"/>
-        </w:trPr>
-        <w:tc>
-          <w:tcPr>
-            <w:tcW w:w="983" w:type="dxa"/>
-          </w:tcPr>
-          <w:p>
-            <w:pPr>
-              <w:jc w:val="center"/>
-              <w:rPr>
-                <w:u w:val="single"/>
-              </w:rPr>
-            </w:pPr>
-          </w:p>
-        </w:tc>
-        <w:tc>
-          <w:tcPr>
-            <w:tcW w:w="817" w:type="dxa"/>
-          </w:tcPr>
-          <w:p>
-            <w:pPr>
-              <w:jc w:val="center"/>
-              <w:rPr>
-                <w:u w:val="single"/>
-              </w:rPr>
-            </w:pPr>
-          </w:p>
-        </w:tc>
-      </w:tr>
-    </w:tbl>
     <w:p>
       <w:pPr>
         <w:jc w:val="center"/>
@@ -1390,7 +1313,7 @@
         <mc:AlternateContent>
           <mc:Choice Requires="wps">
             <w:drawing>
-              <wp:anchor distT="0" distB="0" distL="114300" distR="114300" simplePos="0" relativeHeight="251659264" behindDoc="0" locked="0" layoutInCell="1" allowOverlap="1" wp14:anchorId="19636765" wp14:editId="6118854B">
+              <wp:anchor distT="0" distB="0" distL="114300" distR="114300" simplePos="0" relativeHeight="251659264" behindDoc="0" locked="0" layoutInCell="1" allowOverlap="1" wp14:anchorId="19636765" wp14:editId="508B786D">
                 <wp:simplePos x="0" y="0"/>
                 <wp:positionH relativeFrom="column">
                   <wp:posOffset>2990850</wp:posOffset>
@@ -1445,7 +1368,11 @@
           </mc:Choice>
           <mc:Fallback>
             <w:pict>
-              <v:shape w14:anchorId="2027D35A" id="Straight Arrow Connector 5" o:spid="_x0000_s1026" type="#_x0000_t32" style="position:absolute;margin-left:235.5pt;margin-top:3.65pt;width:109.8pt;height:3.6pt;z-index:251659264;visibility:visible;mso-wrap-style:square;mso-width-percent:0;mso-height-percent:0;mso-wrap-distance-left:9pt;mso-wrap-distance-top:0;mso-wrap-distance-right:9pt;mso-wrap-distance-bottom:0;mso-position-horizontal:absolute;mso-position-horizontal-relative:text;mso-position-vertical:absolute;mso-position-vertical-relative:text;mso-width-percent:0;mso-height-percent:0;mso-width-relative:page;mso-height-relative:page" o:gfxdata="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">
+              <v:shapetype w14:anchorId="1E0552C6" id="_x0000_t32" coordsize="21600,21600" o:spt="32" o:oned="t" path="m,l21600,21600e" filled="f">
+                <v:path arrowok="t" fillok="f" o:connecttype="none"/>
+                <o:lock v:ext="edit" shapetype="t"/>
+              </v:shapetype>
+              <v:shape id="Straight Arrow Connector 5" o:spid="_x0000_s1026" type="#_x0000_t32" style="position:absolute;margin-left:235.5pt;margin-top:3.65pt;width:109.8pt;height:3.6pt;z-index:251659264;visibility:visible;mso-wrap-style:square;mso-width-percent:0;mso-height-percent:0;mso-wrap-distance-left:9pt;mso-wrap-distance-top:0;mso-wrap-distance-right:9pt;mso-wrap-distance-bottom:0;mso-position-horizontal:absolute;mso-position-horizontal-relative:text;mso-position-vertical:absolute;mso-position-vertical-relative:text;mso-width-percent:0;mso-height-percent:0;mso-width-relative:page;mso-height-relative:page" o:gfxdata="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">
                 <v:stroke dashstyle="dash" endarrow="block"/>
               </v:shape>
             </w:pict>
@@ -1455,7 +1382,168 @@
     </w:p>
     <w:tbl>
       <w:tblPr>
-        <w:tblpPr w:leftFromText="180" w:rightFromText="180" w:vertAnchor="page" w:horzAnchor="page" w:tblpX="7501" w:tblpY="11951"/>
+        <w:tblpPr w:leftFromText="180" w:rightFromText="180" w:vertAnchor="text" w:horzAnchor="page" w:tblpX="691" w:tblpY="1941"/>
+        <w:tblW w:w="0" w:type="auto"/>
+        <w:tblBorders>
+          <w:top w:val="single" w:sz="4" w:space="0" w:color="auto"/>
+          <w:left w:val="single" w:sz="4" w:space="0" w:color="auto"/>
+          <w:bottom w:val="single" w:sz="4" w:space="0" w:color="auto"/>
+          <w:right w:val="single" w:sz="4" w:space="0" w:color="auto"/>
+          <w:insideH w:val="single" w:sz="4" w:space="0" w:color="auto"/>
+          <w:insideV w:val="single" w:sz="4" w:space="0" w:color="auto"/>
+        </w:tblBorders>
+        <w:tblLook w:val="0000" w:firstRow="0" w:lastRow="0" w:firstColumn="0" w:lastColumn="0" w:noHBand="0" w:noVBand="0"/>
+      </w:tblPr>
+      <w:tblGrid>
+        <w:gridCol w:w="1468"/>
+        <w:gridCol w:w="1222"/>
+      </w:tblGrid>
+      <w:tr>
+        <w:trPr>
+          <w:trHeight w:val="476"/>
+        </w:trPr>
+        <w:tc>
+          <w:tcPr>
+            <w:tcW w:w="2690" w:type="dxa"/>
+            <w:gridSpan w:val="2"/>
+          </w:tcPr>
+          <w:p>
+            <w:pPr>
+              <w:jc w:val="center"/>
+              <w:rPr>
+                <w:sz w:val="24"/>
+                <w:szCs w:val="24"/>
+              </w:rPr>
+            </w:pPr>
+            <w:r>
+              <w:rPr>
+                <w:sz w:val="24"/>
+                <w:szCs w:val="24"/>
+              </w:rPr>
+              <w:t xml:space="preserve">Population </w:t>
+            </w:r>
+            <w:r>
+              <w:rPr>
+                <w:sz w:val="24"/>
+                <w:szCs w:val="24"/>
+              </w:rPr>
+              <w:t>Dimension</w:t>
+            </w:r>
+          </w:p>
+        </w:tc>
+      </w:tr>
+      <w:tr>
+        <w:trPr>
+          <w:trHeight w:val="352"/>
+        </w:trPr>
+        <w:tc>
+          <w:tcPr>
+            <w:tcW w:w="1468" w:type="dxa"/>
+          </w:tcPr>
+          <w:p>
+            <w:pPr>
+              <w:jc w:val="center"/>
+              <w:rPr>
+                <w:u w:val="single"/>
+              </w:rPr>
+            </w:pPr>
+          </w:p>
+        </w:tc>
+        <w:tc>
+          <w:tcPr>
+            <w:tcW w:w="1222" w:type="dxa"/>
+          </w:tcPr>
+          <w:p>
+            <w:pPr>
+              <w:jc w:val="center"/>
+              <w:rPr>
+                <w:u w:val="single"/>
+              </w:rPr>
+            </w:pPr>
+          </w:p>
+        </w:tc>
+      </w:tr>
+    </w:tbl>
+    <w:tbl>
+      <w:tblPr>
+        <w:tblpPr w:leftFromText="180" w:rightFromText="180" w:vertAnchor="text" w:horzAnchor="page" w:tblpX="4071" w:tblpY="2061"/>
+        <w:tblW w:w="0" w:type="auto"/>
+        <w:tblBorders>
+          <w:top w:val="single" w:sz="4" w:space="0" w:color="auto"/>
+          <w:left w:val="single" w:sz="4" w:space="0" w:color="auto"/>
+          <w:bottom w:val="single" w:sz="4" w:space="0" w:color="auto"/>
+          <w:right w:val="single" w:sz="4" w:space="0" w:color="auto"/>
+          <w:insideH w:val="single" w:sz="4" w:space="0" w:color="auto"/>
+          <w:insideV w:val="single" w:sz="4" w:space="0" w:color="auto"/>
+        </w:tblBorders>
+        <w:tblLook w:val="0000" w:firstRow="0" w:lastRow="0" w:firstColumn="0" w:lastColumn="0" w:noHBand="0" w:noVBand="0"/>
+      </w:tblPr>
+      <w:tblGrid>
+        <w:gridCol w:w="1266"/>
+        <w:gridCol w:w="1053"/>
+      </w:tblGrid>
+      <w:tr>
+        <w:trPr>
+          <w:trHeight w:val="500"/>
+        </w:trPr>
+        <w:tc>
+          <w:tcPr>
+            <w:tcW w:w="2319" w:type="dxa"/>
+            <w:gridSpan w:val="2"/>
+          </w:tcPr>
+          <w:p>
+            <w:pPr>
+              <w:jc w:val="center"/>
+              <w:rPr>
+                <w:sz w:val="24"/>
+                <w:szCs w:val="24"/>
+              </w:rPr>
+            </w:pPr>
+            <w:r>
+              <w:rPr>
+                <w:sz w:val="24"/>
+                <w:szCs w:val="24"/>
+              </w:rPr>
+              <w:t>Age Group Dimension</w:t>
+            </w:r>
+          </w:p>
+        </w:tc>
+      </w:tr>
+      <w:tr>
+        <w:trPr>
+          <w:trHeight w:val="369"/>
+        </w:trPr>
+        <w:tc>
+          <w:tcPr>
+            <w:tcW w:w="1266" w:type="dxa"/>
+          </w:tcPr>
+          <w:p>
+            <w:pPr>
+              <w:jc w:val="center"/>
+              <w:rPr>
+                <w:u w:val="single"/>
+              </w:rPr>
+            </w:pPr>
+          </w:p>
+        </w:tc>
+        <w:tc>
+          <w:tcPr>
+            <w:tcW w:w="1053" w:type="dxa"/>
+          </w:tcPr>
+          <w:p>
+            <w:pPr>
+              <w:jc w:val="center"/>
+              <w:rPr>
+                <w:u w:val="single"/>
+              </w:rPr>
+            </w:pPr>
+          </w:p>
+        </w:tc>
+      </w:tr>
+    </w:tbl>
+    <w:tbl>
+      <w:tblPr>
+        <w:tblpPr w:leftFromText="180" w:rightFromText="180" w:vertAnchor="page" w:horzAnchor="page" w:tblpX="7501" w:tblpY="12251"/>
         <w:tblW w:w="0" w:type="auto"/>
         <w:tblBorders>
           <w:top w:val="single" w:sz="4" w:space="0" w:color="auto"/>
@@ -1538,96 +1626,18 @@
         <mc:AlternateContent>
           <mc:Choice Requires="wps">
             <w:drawing>
-              <wp:anchor distT="0" distB="0" distL="114300" distR="114300" simplePos="0" relativeHeight="251665408" behindDoc="0" locked="0" layoutInCell="1" allowOverlap="1" wp14:anchorId="0A6D3EC1" wp14:editId="00FA8AD9">
+              <wp:anchor distT="0" distB="0" distL="114300" distR="114300" simplePos="0" relativeHeight="251674624" behindDoc="0" locked="0" layoutInCell="1" allowOverlap="1" wp14:anchorId="3AB1287D" wp14:editId="0A5D634C">
                 <wp:simplePos x="0" y="0"/>
                 <wp:positionH relativeFrom="column">
-                  <wp:posOffset>2927350</wp:posOffset>
+                  <wp:posOffset>2381250</wp:posOffset>
                 </wp:positionH>
                 <wp:positionV relativeFrom="paragraph">
-                  <wp:posOffset>195580</wp:posOffset>
+                  <wp:posOffset>240665</wp:posOffset>
                 </wp:positionV>
-                <wp:extent cx="807720" cy="693420"/>
-                <wp:effectExtent l="0" t="0" r="49530" b="30480"/>
+                <wp:extent cx="50800" cy="1054100"/>
+                <wp:effectExtent l="19050" t="0" r="63500" b="50800"/>
                 <wp:wrapNone/>
-                <wp:docPr id="232863996" name="Straight Arrow Connector 1"/>
-                <wp:cNvGraphicFramePr>
-                  <a:graphicFrameLocks xmlns:a="http://schemas.openxmlformats.org/drawingml/2006/main"/>
-                </wp:cNvGraphicFramePr>
-                <a:graphic xmlns:a="http://schemas.openxmlformats.org/drawingml/2006/main">
-                  <a:graphicData uri="http://schemas.microsoft.com/office/word/2010/wordprocessingShape">
-                    <wps:wsp>
-                      <wps:cNvCnPr>
-                        <a:cxnSpLocks/>
-                      </wps:cNvCnPr>
-                      <wps:spPr>
-                        <a:xfrm>
-                          <a:off x="0" y="0"/>
-                          <a:ext cx="807720" cy="693420"/>
-                        </a:xfrm>
-                        <a:prstGeom prst="straightConnector1">
-                          <a:avLst/>
-                        </a:prstGeom>
-                        <a:ln>
-                          <a:prstDash val="dash"/>
-                          <a:tailEnd type="triangle"/>
-                        </a:ln>
-                      </wps:spPr>
-                      <wps:style>
-                        <a:lnRef idx="1">
-                          <a:schemeClr val="dk1"/>
-                        </a:lnRef>
-                        <a:fillRef idx="0">
-                          <a:schemeClr val="dk1"/>
-                        </a:fillRef>
-                        <a:effectRef idx="0">
-                          <a:schemeClr val="dk1"/>
-                        </a:effectRef>
-                        <a:fontRef idx="minor">
-                          <a:schemeClr val="tx1"/>
-                        </a:fontRef>
-                      </wps:style>
-                      <wps:bodyPr/>
-                    </wps:wsp>
-                  </a:graphicData>
-                </a:graphic>
-                <wp14:sizeRelH relativeFrom="page">
-                  <wp14:pctWidth>0</wp14:pctWidth>
-                </wp14:sizeRelH>
-                <wp14:sizeRelV relativeFrom="page">
-                  <wp14:pctHeight>0</wp14:pctHeight>
-                </wp14:sizeRelV>
-              </wp:anchor>
-            </w:drawing>
-          </mc:Choice>
-          <mc:Fallback>
-            <w:pict>
-              <v:shape w14:anchorId="093FD800" id="Straight Arrow Connector 1" o:spid="_x0000_s1026" type="#_x0000_t32" style="position:absolute;margin-left:230.5pt;margin-top:15.4pt;width:63.6pt;height:54.6pt;z-index:251665408;visibility:visible;mso-wrap-style:square;mso-width-percent:0;mso-height-percent:0;mso-wrap-distance-left:9pt;mso-wrap-distance-top:0;mso-wrap-distance-right:9pt;mso-wrap-distance-bottom:0;mso-position-horizontal:absolute;mso-position-horizontal-relative:text;mso-position-vertical:absolute;mso-position-vertical-relative:text;mso-width-percent:0;mso-height-percent:0;mso-width-relative:page;mso-height-relative:page" o:gfxdata="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" strokecolor="black [3200]" strokeweight=".5pt">
-                <v:stroke dashstyle="dash" endarrow="block" joinstyle="miter"/>
-                <o:lock v:ext="edit" shapetype="f"/>
-              </v:shape>
-            </w:pict>
-          </mc:Fallback>
-        </mc:AlternateContent>
-      </w:r>
-      <w:r>
-        <w:rPr>
-          <w:noProof/>
-        </w:rPr>
-        <mc:AlternateContent>
-          <mc:Choice Requires="wps">
-            <w:drawing>
-              <wp:anchor distT="0" distB="0" distL="114300" distR="114300" simplePos="0" relativeHeight="251664384" behindDoc="0" locked="0" layoutInCell="1" allowOverlap="1" wp14:anchorId="73256F40" wp14:editId="1D54C531">
-                <wp:simplePos x="0" y="0"/>
-                <wp:positionH relativeFrom="column">
-                  <wp:posOffset>2432050</wp:posOffset>
-                </wp:positionH>
-                <wp:positionV relativeFrom="paragraph">
-                  <wp:posOffset>287655</wp:posOffset>
-                </wp:positionV>
-                <wp:extent cx="7620" cy="838200"/>
-                <wp:effectExtent l="38100" t="0" r="49530" b="38100"/>
-                <wp:wrapNone/>
-                <wp:docPr id="1983711160" name="Straight Arrow Connector 3"/>
+                <wp:docPr id="120507289" name="Straight Arrow Connector 5"/>
                 <wp:cNvGraphicFramePr>
                   <a:graphicFrameLocks xmlns:a="http://schemas.openxmlformats.org/drawingml/2006/main"/>
                 </wp:cNvGraphicFramePr>
@@ -1640,7 +1650,7 @@
                       <wps:spPr bwMode="auto">
                         <a:xfrm>
                           <a:off x="0" y="0"/>
-                          <a:ext cx="7620" cy="838200"/>
+                          <a:ext cx="50800" cy="1054100"/>
                         </a:xfrm>
                         <a:prstGeom prst="straightConnector1">
                           <a:avLst/>
@@ -1671,7 +1681,145 @@
           </mc:Choice>
           <mc:Fallback>
             <w:pict>
-              <v:shape w14:anchorId="06703E40" id="Straight Arrow Connector 3" o:spid="_x0000_s1026" type="#_x0000_t32" style="position:absolute;margin-left:191.5pt;margin-top:22.65pt;width:.6pt;height:66pt;z-index:251664384;visibility:visible;mso-wrap-style:square;mso-width-percent:0;mso-height-percent:0;mso-wrap-distance-left:9pt;mso-wrap-distance-top:0;mso-wrap-distance-right:9pt;mso-wrap-distance-bottom:0;mso-position-horizontal:absolute;mso-position-horizontal-relative:text;mso-position-vertical:absolute;mso-position-vertical-relative:text;mso-width-percent:0;mso-height-percent:0;mso-width-relative:page;mso-height-relative:page" o:gfxdata="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">
+              <v:shape w14:anchorId="46338930" id="Straight Arrow Connector 5" o:spid="_x0000_s1026" type="#_x0000_t32" style="position:absolute;margin-left:187.5pt;margin-top:18.95pt;width:4pt;height:83pt;z-index:251674624;visibility:visible;mso-wrap-style:square;mso-width-percent:0;mso-height-percent:0;mso-wrap-distance-left:9pt;mso-wrap-distance-top:0;mso-wrap-distance-right:9pt;mso-wrap-distance-bottom:0;mso-position-horizontal:absolute;mso-position-horizontal-relative:text;mso-position-vertical:absolute;mso-position-vertical-relative:text;mso-width-percent:0;mso-height-percent:0;mso-width-relative:page;mso-height-relative:page" o:gfxdata="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">
+                <v:stroke dashstyle="dash" endarrow="block"/>
+              </v:shape>
+            </w:pict>
+          </mc:Fallback>
+        </mc:AlternateContent>
+      </w:r>
+      <w:r>
+        <w:rPr>
+          <w:noProof/>
+        </w:rPr>
+        <mc:AlternateContent>
+          <mc:Choice Requires="wps">
+            <w:drawing>
+              <wp:anchor distT="0" distB="0" distL="114300" distR="114300" simplePos="0" relativeHeight="251676672" behindDoc="0" locked="0" layoutInCell="1" allowOverlap="1" wp14:anchorId="6E18BE7F" wp14:editId="02961E4C">
+                <wp:simplePos x="0" y="0"/>
+                <wp:positionH relativeFrom="column">
+                  <wp:posOffset>2927350</wp:posOffset>
+                </wp:positionH>
+                <wp:positionV relativeFrom="paragraph">
+                  <wp:posOffset>151765</wp:posOffset>
+                </wp:positionV>
+                <wp:extent cx="914400" cy="965200"/>
+                <wp:effectExtent l="0" t="0" r="57150" b="63500"/>
+                <wp:wrapNone/>
+                <wp:docPr id="373807533" name="Straight Arrow Connector 5"/>
+                <wp:cNvGraphicFramePr>
+                  <a:graphicFrameLocks xmlns:a="http://schemas.openxmlformats.org/drawingml/2006/main"/>
+                </wp:cNvGraphicFramePr>
+                <a:graphic xmlns:a="http://schemas.openxmlformats.org/drawingml/2006/main">
+                  <a:graphicData uri="http://schemas.microsoft.com/office/word/2010/wordprocessingShape">
+                    <wps:wsp>
+                      <wps:cNvCnPr>
+                        <a:cxnSpLocks noChangeShapeType="1"/>
+                      </wps:cNvCnPr>
+                      <wps:spPr bwMode="auto">
+                        <a:xfrm>
+                          <a:off x="0" y="0"/>
+                          <a:ext cx="914400" cy="965200"/>
+                        </a:xfrm>
+                        <a:prstGeom prst="straightConnector1">
+                          <a:avLst/>
+                        </a:prstGeom>
+                        <a:noFill/>
+                        <a:ln w="9525" cap="flat">
+                          <a:solidFill>
+                            <a:srgbClr val="000000"/>
+                          </a:solidFill>
+                          <a:prstDash val="dash"/>
+                          <a:round/>
+                          <a:headEnd type="none" w="med" len="med"/>
+                          <a:tailEnd type="triangle" w="med" len="med"/>
+                        </a:ln>
+                      </wps:spPr>
+                      <wps:bodyPr/>
+                    </wps:wsp>
+                  </a:graphicData>
+                </a:graphic>
+                <wp14:sizeRelH relativeFrom="page">
+                  <wp14:pctWidth>0</wp14:pctWidth>
+                </wp14:sizeRelH>
+                <wp14:sizeRelV relativeFrom="page">
+                  <wp14:pctHeight>0</wp14:pctHeight>
+                </wp14:sizeRelV>
+              </wp:anchor>
+            </w:drawing>
+          </mc:Choice>
+          <mc:Fallback>
+            <w:pict>
+              <v:shape w14:anchorId="144E1313" id="Straight Arrow Connector 5" o:spid="_x0000_s1026" type="#_x0000_t32" style="position:absolute;margin-left:230.5pt;margin-top:11.95pt;width:1in;height:76pt;z-index:251676672;visibility:visible;mso-wrap-style:square;mso-width-percent:0;mso-height-percent:0;mso-wrap-distance-left:9pt;mso-wrap-distance-top:0;mso-wrap-distance-right:9pt;mso-wrap-distance-bottom:0;mso-position-horizontal:absolute;mso-position-horizontal-relative:text;mso-position-vertical:absolute;mso-position-vertical-relative:text;mso-width-percent:0;mso-height-percent:0;mso-width-relative:page;mso-height-relative:page" o:gfxdata="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">
+                <v:stroke dashstyle="dash" endarrow="block"/>
+              </v:shape>
+            </w:pict>
+          </mc:Fallback>
+        </mc:AlternateContent>
+      </w:r>
+      <w:r>
+        <w:rPr>
+          <w:noProof/>
+        </w:rPr>
+        <mc:AlternateContent>
+          <mc:Choice Requires="wps">
+            <w:drawing>
+              <wp:anchor distT="0" distB="0" distL="114300" distR="114300" simplePos="0" relativeHeight="251672576" behindDoc="0" locked="0" layoutInCell="1" allowOverlap="1" wp14:anchorId="16BA627D" wp14:editId="24C3B8D8">
+                <wp:simplePos x="0" y="0"/>
+                <wp:positionH relativeFrom="column">
+                  <wp:posOffset>850900</wp:posOffset>
+                </wp:positionH>
+                <wp:positionV relativeFrom="paragraph">
+                  <wp:posOffset>164465</wp:posOffset>
+                </wp:positionV>
+                <wp:extent cx="1094740" cy="1041400"/>
+                <wp:effectExtent l="38100" t="0" r="29210" b="63500"/>
+                <wp:wrapNone/>
+                <wp:docPr id="1925090320" name="Straight Arrow Connector 5"/>
+                <wp:cNvGraphicFramePr>
+                  <a:graphicFrameLocks xmlns:a="http://schemas.openxmlformats.org/drawingml/2006/main"/>
+                </wp:cNvGraphicFramePr>
+                <a:graphic xmlns:a="http://schemas.openxmlformats.org/drawingml/2006/main">
+                  <a:graphicData uri="http://schemas.microsoft.com/office/word/2010/wordprocessingShape">
+                    <wps:wsp>
+                      <wps:cNvCnPr>
+                        <a:cxnSpLocks noChangeShapeType="1"/>
+                      </wps:cNvCnPr>
+                      <wps:spPr bwMode="auto">
+                        <a:xfrm flipH="1">
+                          <a:off x="0" y="0"/>
+                          <a:ext cx="1094740" cy="1041400"/>
+                        </a:xfrm>
+                        <a:prstGeom prst="straightConnector1">
+                          <a:avLst/>
+                        </a:prstGeom>
+                        <a:noFill/>
+                        <a:ln w="9525" cap="flat">
+                          <a:solidFill>
+                            <a:srgbClr val="000000"/>
+                          </a:solidFill>
+                          <a:prstDash val="dash"/>
+                          <a:round/>
+                          <a:headEnd type="none" w="med" len="med"/>
+                          <a:tailEnd type="triangle" w="med" len="med"/>
+                        </a:ln>
+                      </wps:spPr>
+                      <wps:bodyPr/>
+                    </wps:wsp>
+                  </a:graphicData>
+                </a:graphic>
+                <wp14:sizeRelH relativeFrom="page">
+                  <wp14:pctWidth>0</wp14:pctWidth>
+                </wp14:sizeRelH>
+                <wp14:sizeRelV relativeFrom="page">
+                  <wp14:pctHeight>0</wp14:pctHeight>
+                </wp14:sizeRelV>
+              </wp:anchor>
+            </w:drawing>
+          </mc:Choice>
+          <mc:Fallback>
+            <w:pict>
+              <v:shape w14:anchorId="4FCA92A5" id="Straight Arrow Connector 5" o:spid="_x0000_s1026" type="#_x0000_t32" style="position:absolute;margin-left:67pt;margin-top:12.95pt;width:86.2pt;height:82pt;flip:x;z-index:251672576;visibility:visible;mso-wrap-style:square;mso-width-percent:0;mso-height-percent:0;mso-wrap-distance-left:9pt;mso-wrap-distance-top:0;mso-wrap-distance-right:9pt;mso-wrap-distance-bottom:0;mso-position-horizontal:absolute;mso-position-horizontal-relative:text;mso-position-vertical:absolute;mso-position-vertical-relative:text;mso-width-percent:0;mso-height-percent:0;mso-width-relative:page;mso-height-relative:page" o:gfxdata="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">
                 <v:stroke dashstyle="dash" endarrow="block"/>
               </v:shape>
             </w:pict>
@@ -2089,7 +2237,7 @@
   <w:style w:type="paragraph" w:default="1" w:styleId="Normal">
     <w:name w:val="Normal"/>
     <w:qFormat/>
-    <w:rsid w:val="00BB6B7F"/>
+    <w:rsid w:val="001D3DB1"/>
   </w:style>
   <w:style w:type="paragraph" w:styleId="Heading1">
     <w:name w:val="heading 1"/>

</xml_diff>

<commit_message>
Refinements on the Architecture to include the population as a dimesion
</commit_message>
<xml_diff>
--- a/SQL SCRIPTS/Data WareHouse/Datawarehouse Architecture/DataWaeHouse Architecture2.docx
+++ b/SQL SCRIPTS/Data WareHouse/Datawarehouse Architecture/DataWaeHouse Architecture2.docx
@@ -63,18 +63,44 @@
       </w:pPr>
       <w:r>
         <w:rPr>
+          <w:sz w:val="26"/>
+          <w:szCs w:val="26"/>
+        </w:rPr>
+        <w:tab/>
+      </w:r>
+      <w:r>
+        <w:rPr>
+          <w:b/>
+          <w:bCs/>
+          <w:sz w:val="26"/>
+          <w:szCs w:val="26"/>
+        </w:rPr>
+        <w:t>Model Design: Star Schema</w:t>
+      </w:r>
+    </w:p>
+    <w:p>
+      <w:pPr>
+        <w:rPr>
+          <w:b/>
+          <w:bCs/>
+          <w:sz w:val="26"/>
+          <w:szCs w:val="26"/>
+        </w:rPr>
+      </w:pPr>
+      <w:r>
+        <w:rPr>
           <w:noProof/>
         </w:rPr>
         <mc:AlternateContent>
           <mc:Choice Requires="wps">
             <w:drawing>
-              <wp:anchor distT="0" distB="0" distL="114300" distR="114300" simplePos="0" relativeHeight="251668480" behindDoc="0" locked="0" layoutInCell="1" allowOverlap="1" wp14:anchorId="755889A6" wp14:editId="03704299">
+              <wp:anchor distT="0" distB="0" distL="114300" distR="114300" simplePos="0" relativeHeight="251668480" behindDoc="0" locked="0" layoutInCell="1" allowOverlap="1" wp14:anchorId="755889A6" wp14:editId="5BD280F1">
                 <wp:simplePos x="0" y="0"/>
                 <wp:positionH relativeFrom="margin">
-                  <wp:posOffset>-247650</wp:posOffset>
+                  <wp:posOffset>-407138</wp:posOffset>
                 </wp:positionH>
                 <wp:positionV relativeFrom="paragraph">
-                  <wp:posOffset>309880</wp:posOffset>
+                  <wp:posOffset>330716</wp:posOffset>
                 </wp:positionV>
                 <wp:extent cx="984885" cy="1045210"/>
                 <wp:effectExtent l="0" t="0" r="5715" b="2540"/>
@@ -175,7 +201,7 @@
                 </v:handles>
                 <o:complex v:ext="view"/>
               </v:shapetype>
-              <v:shape id="Cylinder 13" o:spid="_x0000_s1026" type="#_x0000_t22" style="position:absolute;margin-left:-19.5pt;margin-top:24.4pt;width:77.55pt;height:82.3pt;z-index:251668480;visibility:visible;mso-wrap-style:square;mso-width-percent:0;mso-height-percent:0;mso-wrap-distance-left:9pt;mso-wrap-distance-top:0;mso-wrap-distance-right:9pt;mso-wrap-distance-bottom:0;mso-position-horizontal:absolute;mso-position-horizontal-relative:margin;mso-position-vertical:absolute;mso-position-vertical-relative:text;mso-width-percent:0;mso-height-percent:0;mso-width-relative:margin;mso-height-relative:margin;v-text-anchor:middle" o:gfxdata="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" adj="5088" fillcolor="white [3201]" strokecolor="black [3200]" strokeweight="1pt">
+              <v:shape id="Cylinder 13" o:spid="_x0000_s1026" type="#_x0000_t22" style="position:absolute;margin-left:-32.05pt;margin-top:26.05pt;width:77.55pt;height:82.3pt;z-index:251668480;visibility:visible;mso-wrap-style:square;mso-width-percent:0;mso-height-percent:0;mso-wrap-distance-left:9pt;mso-wrap-distance-top:0;mso-wrap-distance-right:9pt;mso-wrap-distance-bottom:0;mso-position-horizontal:absolute;mso-position-horizontal-relative:margin;mso-position-vertical:absolute;mso-position-vertical-relative:text;mso-width-percent:0;mso-height-percent:0;mso-width-relative:margin;mso-height-relative:margin;v-text-anchor:middle" o:gfxdata="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" adj="5088" fillcolor="white [3201]" strokecolor="black [3200]" strokeweight="1pt">
                 <v:stroke joinstyle="miter"/>
                 <v:path arrowok="t"/>
                 <v:textbox>
@@ -217,100 +243,137 @@
       </w:r>
       <w:r>
         <w:rPr>
-          <w:sz w:val="26"/>
-          <w:szCs w:val="26"/>
-        </w:rPr>
-        <w:tab/>
+          <w:noProof/>
+        </w:rPr>
+        <mc:AlternateContent>
+          <mc:Choice Requires="wps">
+            <w:drawing>
+              <wp:anchor distT="0" distB="0" distL="114300" distR="114300" simplePos="0" relativeHeight="251678720" behindDoc="0" locked="0" layoutInCell="1" allowOverlap="1" wp14:anchorId="2E5976D1" wp14:editId="5254F545">
+                <wp:simplePos x="0" y="0"/>
+                <wp:positionH relativeFrom="margin">
+                  <wp:posOffset>4008105</wp:posOffset>
+                </wp:positionH>
+                <wp:positionV relativeFrom="paragraph">
+                  <wp:posOffset>20098</wp:posOffset>
+                </wp:positionV>
+                <wp:extent cx="984885" cy="1045210"/>
+                <wp:effectExtent l="0" t="0" r="5715" b="2540"/>
+                <wp:wrapNone/>
+                <wp:docPr id="3140722" name="Cylinder 13"/>
+                <wp:cNvGraphicFramePr>
+                  <a:graphicFrameLocks xmlns:a="http://schemas.openxmlformats.org/drawingml/2006/main"/>
+                </wp:cNvGraphicFramePr>
+                <a:graphic xmlns:a="http://schemas.openxmlformats.org/drawingml/2006/main">
+                  <a:graphicData uri="http://schemas.microsoft.com/office/word/2010/wordprocessingShape">
+                    <wps:wsp>
+                      <wps:cNvSpPr>
+                        <a:spLocks/>
+                      </wps:cNvSpPr>
+                      <wps:spPr>
+                        <a:xfrm>
+                          <a:off x="0" y="0"/>
+                          <a:ext cx="984885" cy="1045210"/>
+                        </a:xfrm>
+                        <a:prstGeom prst="can">
+                          <a:avLst/>
+                        </a:prstGeom>
+                      </wps:spPr>
+                      <wps:style>
+                        <a:lnRef idx="2">
+                          <a:schemeClr val="dk1"/>
+                        </a:lnRef>
+                        <a:fillRef idx="1">
+                          <a:schemeClr val="lt1"/>
+                        </a:fillRef>
+                        <a:effectRef idx="0">
+                          <a:schemeClr val="dk1"/>
+                        </a:effectRef>
+                        <a:fontRef idx="minor">
+                          <a:schemeClr val="dk1"/>
+                        </a:fontRef>
+                      </wps:style>
+                      <wps:txbx>
+                        <w:txbxContent>
+                          <w:p>
+                            <w:pPr>
+                              <w:rPr>
+                                <w:sz w:val="28"/>
+                                <w:szCs w:val="28"/>
+                                <w:lang w:val="en-US"/>
+                              </w:rPr>
+                            </w:pPr>
+                            <w:r>
+                              <w:rPr>
+                                <w:sz w:val="28"/>
+                                <w:szCs w:val="28"/>
+                                <w:lang w:val="en-US"/>
+                              </w:rPr>
+                              <w:t>Landing Zone (DB)</w:t>
+                            </w:r>
+                          </w:p>
+                        </w:txbxContent>
+                      </wps:txbx>
+                      <wps:bodyPr rot="0" spcFirstLastPara="0" vertOverflow="overflow" horzOverflow="overflow" vert="horz" wrap="square" lIns="91440" tIns="45720" rIns="91440" bIns="45720" numCol="1" spcCol="0" rtlCol="0" fromWordArt="0" anchor="ctr" anchorCtr="0" forceAA="0" compatLnSpc="1">
+                        <a:prstTxWarp prst="textNoShape">
+                          <a:avLst/>
+                        </a:prstTxWarp>
+                        <a:noAutofit/>
+                      </wps:bodyPr>
+                    </wps:wsp>
+                  </a:graphicData>
+                </a:graphic>
+                <wp14:sizeRelH relativeFrom="margin">
+                  <wp14:pctWidth>0</wp14:pctWidth>
+                </wp14:sizeRelH>
+                <wp14:sizeRelV relativeFrom="margin">
+                  <wp14:pctHeight>0</wp14:pctHeight>
+                </wp14:sizeRelV>
+              </wp:anchor>
+            </w:drawing>
+          </mc:Choice>
+          <mc:Fallback>
+            <w:pict>
+              <v:shape w14:anchorId="2E5976D1" id="_x0000_s1027" type="#_x0000_t22" style="position:absolute;margin-left:315.6pt;margin-top:1.6pt;width:77.55pt;height:82.3pt;z-index:251678720;visibility:visible;mso-wrap-style:square;mso-width-percent:0;mso-height-percent:0;mso-wrap-distance-left:9pt;mso-wrap-distance-top:0;mso-wrap-distance-right:9pt;mso-wrap-distance-bottom:0;mso-position-horizontal:absolute;mso-position-horizontal-relative:margin;mso-position-vertical:absolute;mso-position-vertical-relative:text;mso-width-percent:0;mso-height-percent:0;mso-width-relative:margin;mso-height-relative:margin;v-text-anchor:middle" o:gfxdata="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" adj="5088" fillcolor="white [3201]" strokecolor="black [3200]" strokeweight="1pt">
+                <v:stroke joinstyle="miter"/>
+                <v:path arrowok="t"/>
+                <v:textbox>
+                  <w:txbxContent>
+                    <w:p>
+                      <w:pPr>
+                        <w:rPr>
+                          <w:sz w:val="28"/>
+                          <w:szCs w:val="28"/>
+                          <w:lang w:val="en-US"/>
+                        </w:rPr>
+                      </w:pPr>
+                      <w:r>
+                        <w:rPr>
+                          <w:sz w:val="28"/>
+                          <w:szCs w:val="28"/>
+                          <w:lang w:val="en-US"/>
+                        </w:rPr>
+                        <w:t>Landing Zone (DB)</w:t>
+                      </w:r>
+                    </w:p>
+                  </w:txbxContent>
+                </v:textbox>
+                <w10:wrap anchorx="margin"/>
+              </v:shape>
+            </w:pict>
+          </mc:Fallback>
+        </mc:AlternateContent>
       </w:r>
-      <w:r>
+    </w:p>
+    <w:p/>
+    <w:p>
+      <w:pPr>
         <w:rPr>
           <w:b/>
           <w:bCs/>
           <w:sz w:val="26"/>
           <w:szCs w:val="26"/>
         </w:rPr>
-        <w:t>Model Design: Star Schema</w:t>
-      </w:r>
-    </w:p>
-    <w:tbl>
-      <w:tblPr>
-        <w:tblpPr w:leftFromText="180" w:rightFromText="180" w:vertAnchor="text" w:horzAnchor="page" w:tblpX="7623" w:tblpY="344"/>
-        <w:tblW w:w="0" w:type="auto"/>
-        <w:tblBorders>
-          <w:top w:val="single" w:sz="4" w:space="0" w:color="auto"/>
-          <w:left w:val="single" w:sz="4" w:space="0" w:color="auto"/>
-          <w:bottom w:val="single" w:sz="4" w:space="0" w:color="auto"/>
-          <w:right w:val="single" w:sz="4" w:space="0" w:color="auto"/>
-          <w:insideH w:val="single" w:sz="4" w:space="0" w:color="auto"/>
-          <w:insideV w:val="single" w:sz="4" w:space="0" w:color="auto"/>
-        </w:tblBorders>
-        <w:tblLook w:val="0000" w:firstRow="0" w:lastRow="0" w:firstColumn="0" w:lastColumn="0" w:noHBand="0" w:noVBand="0"/>
-      </w:tblPr>
-      <w:tblGrid>
-        <w:gridCol w:w="1035"/>
-        <w:gridCol w:w="1134"/>
-      </w:tblGrid>
-      <w:tr>
-        <w:trPr>
-          <w:trHeight w:val="654"/>
-        </w:trPr>
-        <w:tc>
-          <w:tcPr>
-            <w:tcW w:w="2169" w:type="dxa"/>
-            <w:gridSpan w:val="2"/>
-          </w:tcPr>
-          <w:p>
-            <w:pPr>
-              <w:jc w:val="center"/>
-              <w:rPr>
-                <w:sz w:val="30"/>
-                <w:szCs w:val="30"/>
-              </w:rPr>
-            </w:pPr>
-            <w:r>
-              <w:rPr>
-                <w:sz w:val="30"/>
-                <w:szCs w:val="30"/>
-              </w:rPr>
-              <w:t>Landing Zone</w:t>
-            </w:r>
-          </w:p>
-        </w:tc>
-      </w:tr>
-      <w:tr>
-        <w:trPr>
-          <w:trHeight w:val="433"/>
-        </w:trPr>
-        <w:tc>
-          <w:tcPr>
-            <w:tcW w:w="1035" w:type="dxa"/>
-          </w:tcPr>
-          <w:p>
-            <w:pPr>
-              <w:jc w:val="center"/>
-              <w:rPr>
-                <w:u w:val="single"/>
-              </w:rPr>
-            </w:pPr>
-          </w:p>
-        </w:tc>
-        <w:tc>
-          <w:tcPr>
-            <w:tcW w:w="1134" w:type="dxa"/>
-          </w:tcPr>
-          <w:p>
-            <w:pPr>
-              <w:jc w:val="center"/>
-              <w:rPr>
-                <w:u w:val="single"/>
-              </w:rPr>
-            </w:pPr>
-          </w:p>
-        </w:tc>
-      </w:tr>
-    </w:tbl>
-    <w:p/>
-    <w:p>
+      </w:pPr>
       <w:r>
         <w:rPr>
           <w:noProof/>
@@ -318,16 +381,16 @@
         <mc:AlternateContent>
           <mc:Choice Requires="wps">
             <w:drawing>
-              <wp:anchor distT="0" distB="0" distL="114300" distR="114300" simplePos="0" relativeHeight="251669504" behindDoc="0" locked="0" layoutInCell="1" allowOverlap="1" wp14:anchorId="2EE95ED9" wp14:editId="0074B3CA">
+              <wp:anchor distT="0" distB="0" distL="114300" distR="114300" simplePos="0" relativeHeight="251669504" behindDoc="0" locked="0" layoutInCell="1" allowOverlap="1" wp14:anchorId="2EE95ED9" wp14:editId="6768AF71">
                 <wp:simplePos x="0" y="0"/>
                 <wp:positionH relativeFrom="column">
-                  <wp:posOffset>844550</wp:posOffset>
+                  <wp:posOffset>637953</wp:posOffset>
                 </wp:positionH>
                 <wp:positionV relativeFrom="paragraph">
-                  <wp:posOffset>255905</wp:posOffset>
+                  <wp:posOffset>259081</wp:posOffset>
                 </wp:positionV>
-                <wp:extent cx="2978150" cy="25400"/>
-                <wp:effectExtent l="6350" t="60325" r="15875" b="28575"/>
+                <wp:extent cx="3285461" cy="45719"/>
+                <wp:effectExtent l="0" t="76200" r="10795" b="50165"/>
                 <wp:wrapNone/>
                 <wp:docPr id="508064183" name="AutoShape 11"/>
                 <wp:cNvGraphicFramePr>
@@ -342,7 +405,7 @@
                       <wps:spPr bwMode="auto">
                         <a:xfrm flipV="1">
                           <a:off x="0" y="0"/>
-                          <a:ext cx="2978150" cy="25400"/>
+                          <a:ext cx="3285461" cy="45719"/>
                         </a:xfrm>
                         <a:prstGeom prst="straightConnector1">
                           <a:avLst/>
@@ -379,11 +442,11 @@
           </mc:Choice>
           <mc:Fallback>
             <w:pict>
-              <v:shapetype w14:anchorId="77F40230" id="_x0000_t32" coordsize="21600,21600" o:spt="32" o:oned="t" path="m,l21600,21600e" filled="f">
+              <v:shapetype w14:anchorId="78D05B1E" id="_x0000_t32" coordsize="21600,21600" o:spt="32" o:oned="t" path="m,l21600,21600e" filled="f">
                 <v:path arrowok="t" fillok="f" o:connecttype="none"/>
                 <o:lock v:ext="edit" shapetype="t"/>
               </v:shapetype>
-              <v:shape id="AutoShape 11" o:spid="_x0000_s1026" type="#_x0000_t32" style="position:absolute;margin-left:66.5pt;margin-top:20.15pt;width:234.5pt;height:2pt;flip:y;z-index:251669504;visibility:visible;mso-wrap-style:square;mso-width-percent:0;mso-height-percent:0;mso-wrap-distance-left:9pt;mso-wrap-distance-top:0;mso-wrap-distance-right:9pt;mso-wrap-distance-bottom:0;mso-position-horizontal:absolute;mso-position-horizontal-relative:text;mso-position-vertical:absolute;mso-position-vertical-relative:text;mso-width-percent:0;mso-height-percent:0;mso-width-relative:page;mso-height-relative:page" o:gfxdata="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">
+              <v:shape id="AutoShape 11" o:spid="_x0000_s1026" type="#_x0000_t32" style="position:absolute;margin-left:50.25pt;margin-top:20.4pt;width:258.7pt;height:3.6pt;flip:y;z-index:251669504;visibility:visible;mso-wrap-style:square;mso-width-percent:0;mso-height-percent:0;mso-wrap-distance-left:9pt;mso-wrap-distance-top:0;mso-wrap-distance-right:9pt;mso-wrap-distance-bottom:0;mso-position-horizontal:absolute;mso-position-horizontal-relative:text;mso-position-vertical:absolute;mso-position-vertical-relative:text;mso-width-percent:0;mso-height-percent:0;mso-width-relative:page;mso-height-relative:page" o:gfxdata="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">
                 <v:stroke endarrow="block"/>
               </v:shape>
             </w:pict>
@@ -400,16 +463,6 @@
           <w:szCs w:val="26"/>
         </w:rPr>
       </w:pPr>
-    </w:p>
-    <w:p>
-      <w:pPr>
-        <w:rPr>
-          <w:b/>
-          <w:bCs/>
-          <w:sz w:val="26"/>
-          <w:szCs w:val="26"/>
-        </w:rPr>
-      </w:pPr>
       <w:r>
         <w:rPr>
           <w:b/>
@@ -421,13 +474,13 @@
         <mc:AlternateContent>
           <mc:Choice Requires="wps">
             <w:drawing>
-              <wp:anchor distT="0" distB="0" distL="114300" distR="114300" simplePos="0" relativeHeight="251670528" behindDoc="0" locked="0" layoutInCell="1" allowOverlap="1" wp14:anchorId="726B5076" wp14:editId="2C4C4911">
+              <wp:anchor distT="0" distB="0" distL="114300" distR="114300" simplePos="0" relativeHeight="251670528" behindDoc="0" locked="0" layoutInCell="1" allowOverlap="1" wp14:anchorId="726B5076" wp14:editId="25D44152">
                 <wp:simplePos x="0" y="0"/>
                 <wp:positionH relativeFrom="column">
-                  <wp:posOffset>4470400</wp:posOffset>
+                  <wp:posOffset>4510420</wp:posOffset>
                 </wp:positionH>
                 <wp:positionV relativeFrom="paragraph">
-                  <wp:posOffset>76200</wp:posOffset>
+                  <wp:posOffset>192848</wp:posOffset>
                 </wp:positionV>
                 <wp:extent cx="6350" cy="736600"/>
                 <wp:effectExtent l="50800" t="9525" r="57150" b="15875"/>
@@ -482,7 +535,7 @@
           </mc:Choice>
           <mc:Fallback>
             <w:pict>
-              <v:shape w14:anchorId="56DFDDBA" id="AutoShape 13" o:spid="_x0000_s1026" type="#_x0000_t32" style="position:absolute;margin-left:352pt;margin-top:6pt;width:.5pt;height:58pt;z-index:251670528;visibility:visible;mso-wrap-style:square;mso-width-percent:0;mso-height-percent:0;mso-wrap-distance-left:9pt;mso-wrap-distance-top:0;mso-wrap-distance-right:9pt;mso-wrap-distance-bottom:0;mso-position-horizontal:absolute;mso-position-horizontal-relative:text;mso-position-vertical:absolute;mso-position-vertical-relative:text;mso-width-percent:0;mso-height-percent:0;mso-width-relative:page;mso-height-relative:page" o:gfxdata="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">
+              <v:shape w14:anchorId="4C1751A5" id="AutoShape 13" o:spid="_x0000_s1026" type="#_x0000_t32" style="position:absolute;margin-left:355.15pt;margin-top:15.2pt;width:.5pt;height:58pt;z-index:251670528;visibility:visible;mso-wrap-style:square;mso-width-percent:0;mso-height-percent:0;mso-wrap-distance-left:9pt;mso-wrap-distance-top:0;mso-wrap-distance-right:9pt;mso-wrap-distance-bottom:0;mso-position-horizontal:absolute;mso-position-horizontal-relative:text;mso-position-vertical:absolute;mso-position-vertical-relative:text;mso-width-percent:0;mso-height-percent:0;mso-width-relative:page;mso-height-relative:page" o:gfxdata="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">
                 <v:stroke endarrow="block"/>
               </v:shape>
             </w:pict>
@@ -579,7 +632,7 @@
     </w:tbl>
     <w:tbl>
       <w:tblPr>
-        <w:tblpPr w:leftFromText="180" w:rightFromText="180" w:vertAnchor="text" w:horzAnchor="page" w:tblpX="7323" w:tblpY="347"/>
+        <w:tblpPr w:leftFromText="180" w:rightFromText="180" w:vertAnchor="text" w:horzAnchor="page" w:tblpX="7468" w:tblpY="498"/>
         <w:tblW w:w="0" w:type="auto"/>
         <w:tblBorders>
           <w:top w:val="single" w:sz="4" w:space="0" w:color="auto"/>
@@ -702,88 +755,7 @@
         <mc:AlternateContent>
           <mc:Choice Requires="wps">
             <w:drawing>
-              <wp:anchor distT="0" distB="0" distL="114300" distR="114300" simplePos="0" relativeHeight="251663360" behindDoc="0" locked="0" layoutInCell="1" allowOverlap="1" wp14:anchorId="3F4972F5" wp14:editId="1448E644">
-                <wp:simplePos x="0" y="0"/>
-                <wp:positionH relativeFrom="column">
-                  <wp:posOffset>2672080</wp:posOffset>
-                </wp:positionH>
-                <wp:positionV relativeFrom="paragraph">
-                  <wp:posOffset>245745</wp:posOffset>
-                </wp:positionV>
-                <wp:extent cx="1211580" cy="1059180"/>
-                <wp:effectExtent l="0" t="76200" r="0" b="121920"/>
-                <wp:wrapNone/>
-                <wp:docPr id="967732815" name="Connector: Elbow 11"/>
-                <wp:cNvGraphicFramePr>
-                  <a:graphicFrameLocks xmlns:a="http://schemas.openxmlformats.org/drawingml/2006/main"/>
-                </wp:cNvGraphicFramePr>
-                <a:graphic xmlns:a="http://schemas.openxmlformats.org/drawingml/2006/main">
-                  <a:graphicData uri="http://schemas.microsoft.com/office/word/2010/wordprocessingShape">
-                    <wps:wsp>
-                      <wps:cNvCnPr>
-                        <a:cxnSpLocks noChangeShapeType="1"/>
-                      </wps:cNvCnPr>
-                      <wps:spPr bwMode="auto">
-                        <a:xfrm rot="5400000">
-                          <a:off x="0" y="0"/>
-                          <a:ext cx="1211580" cy="1059180"/>
-                        </a:xfrm>
-                        <a:prstGeom prst="bentConnector3">
-                          <a:avLst>
-                            <a:gd name="adj1" fmla="val 50000"/>
-                          </a:avLst>
-                        </a:prstGeom>
-                        <a:noFill/>
-                        <a:ln w="9525">
-                          <a:solidFill>
-                            <a:srgbClr val="000000"/>
-                          </a:solidFill>
-                          <a:miter lim="800000"/>
-                          <a:headEnd type="none" w="med" len="med"/>
-                          <a:tailEnd type="triangle" w="med" len="med"/>
-                        </a:ln>
-                      </wps:spPr>
-                      <wps:bodyPr/>
-                    </wps:wsp>
-                  </a:graphicData>
-                </a:graphic>
-                <wp14:sizeRelH relativeFrom="page">
-                  <wp14:pctWidth>0</wp14:pctWidth>
-                </wp14:sizeRelH>
-                <wp14:sizeRelV relativeFrom="page">
-                  <wp14:pctHeight>0</wp14:pctHeight>
-                </wp14:sizeRelV>
-              </wp:anchor>
-            </w:drawing>
-          </mc:Choice>
-          <mc:Fallback>
-            <w:pict>
-              <v:shapetype w14:anchorId="657A2F0E" id="_x0000_t34" coordsize="21600,21600" o:spt="34" o:oned="t" adj="10800" path="m,l@0,0@0,21600,21600,21600e" filled="f">
-                <v:stroke joinstyle="miter"/>
-                <v:formulas>
-                  <v:f eqn="val #0"/>
-                </v:formulas>
-                <v:path arrowok="t" fillok="f" o:connecttype="none"/>
-                <v:handles>
-                  <v:h position="#0,center"/>
-                </v:handles>
-                <o:lock v:ext="edit" shapetype="t"/>
-              </v:shapetype>
-              <v:shape id="Connector: Elbow 11" o:spid="_x0000_s1026" type="#_x0000_t34" style="position:absolute;margin-left:210.4pt;margin-top:19.35pt;width:95.4pt;height:83.4pt;rotation:90;z-index:251663360;visibility:visible;mso-wrap-style:square;mso-width-percent:0;mso-height-percent:0;mso-wrap-distance-left:9pt;mso-wrap-distance-top:0;mso-wrap-distance-right:9pt;mso-wrap-distance-bottom:0;mso-position-horizontal:absolute;mso-position-horizontal-relative:text;mso-position-vertical:absolute;mso-position-vertical-relative:text;mso-width-percent:0;mso-height-percent:0;mso-width-relative:page;mso-height-relative:page" o:gfxdata="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">
-                <v:stroke endarrow="block"/>
-              </v:shape>
-            </w:pict>
-          </mc:Fallback>
-        </mc:AlternateContent>
-      </w:r>
-      <w:r>
-        <w:rPr>
-          <w:noProof/>
-        </w:rPr>
-        <mc:AlternateContent>
-          <mc:Choice Requires="wps">
-            <w:drawing>
-              <wp:anchor distT="0" distB="0" distL="114300" distR="114300" simplePos="0" relativeHeight="251661312" behindDoc="0" locked="0" layoutInCell="1" allowOverlap="1" wp14:anchorId="14CF9F2E" wp14:editId="661192C8">
+              <wp:anchor distT="0" distB="0" distL="114300" distR="114300" simplePos="0" relativeHeight="251661312" behindDoc="0" locked="0" layoutInCell="1" allowOverlap="1" wp14:anchorId="14CF9F2E" wp14:editId="46587802">
                 <wp:simplePos x="0" y="0"/>
                 <wp:positionH relativeFrom="column">
                   <wp:posOffset>2275840</wp:posOffset>
@@ -838,7 +810,7 @@
           </mc:Choice>
           <mc:Fallback>
             <w:pict>
-              <v:shape w14:anchorId="685752E6" id="Straight Arrow Connector 9" o:spid="_x0000_s1026" type="#_x0000_t32" style="position:absolute;margin-left:179.2pt;margin-top:6.85pt;width:1.15pt;height:98.4pt;flip:x y;z-index:251661312;visibility:visible;mso-wrap-style:square;mso-width-percent:0;mso-height-percent:0;mso-wrap-distance-left:9pt;mso-wrap-distance-top:0;mso-wrap-distance-right:9pt;mso-wrap-distance-bottom:0;mso-position-horizontal:absolute;mso-position-horizontal-relative:text;mso-position-vertical:absolute;mso-position-vertical-relative:text;mso-width-percent:0;mso-height-percent:0;mso-width-relative:page;mso-height-relative:page" o:gfxdata="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">
+              <v:shape w14:anchorId="412BCAB9" id="Straight Arrow Connector 9" o:spid="_x0000_s1026" type="#_x0000_t32" style="position:absolute;margin-left:179.2pt;margin-top:6.85pt;width:1.15pt;height:98.4pt;flip:x y;z-index:251661312;visibility:visible;mso-wrap-style:square;mso-width-percent:0;mso-height-percent:0;mso-wrap-distance-left:9pt;mso-wrap-distance-top:0;mso-wrap-distance-right:9pt;mso-wrap-distance-bottom:0;mso-position-horizontal:absolute;mso-position-horizontal-relative:text;mso-position-vertical:absolute;mso-position-vertical-relative:text;mso-width-percent:0;mso-height-percent:0;mso-width-relative:page;mso-height-relative:page" o:gfxdata="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">
                 <v:stroke dashstyle="dash" endarrow="block"/>
               </v:shape>
             </w:pict>
@@ -853,6 +825,87 @@
           <w:u w:val="single"/>
         </w:rPr>
       </w:pPr>
+      <w:r>
+        <w:rPr>
+          <w:noProof/>
+        </w:rPr>
+        <mc:AlternateContent>
+          <mc:Choice Requires="wps">
+            <w:drawing>
+              <wp:anchor distT="0" distB="0" distL="114300" distR="114300" simplePos="0" relativeHeight="251663360" behindDoc="0" locked="0" layoutInCell="1" allowOverlap="1" wp14:anchorId="3F4972F5" wp14:editId="73E6D183">
+                <wp:simplePos x="0" y="0"/>
+                <wp:positionH relativeFrom="column">
+                  <wp:posOffset>2778125</wp:posOffset>
+                </wp:positionH>
+                <wp:positionV relativeFrom="paragraph">
+                  <wp:posOffset>34290</wp:posOffset>
+                </wp:positionV>
+                <wp:extent cx="1211580" cy="1059180"/>
+                <wp:effectExtent l="0" t="76200" r="0" b="121920"/>
+                <wp:wrapNone/>
+                <wp:docPr id="967732815" name="Connector: Elbow 11"/>
+                <wp:cNvGraphicFramePr>
+                  <a:graphicFrameLocks xmlns:a="http://schemas.openxmlformats.org/drawingml/2006/main"/>
+                </wp:cNvGraphicFramePr>
+                <a:graphic xmlns:a="http://schemas.openxmlformats.org/drawingml/2006/main">
+                  <a:graphicData uri="http://schemas.microsoft.com/office/word/2010/wordprocessingShape">
+                    <wps:wsp>
+                      <wps:cNvCnPr>
+                        <a:cxnSpLocks noChangeShapeType="1"/>
+                      </wps:cNvCnPr>
+                      <wps:spPr bwMode="auto">
+                        <a:xfrm rot="5400000">
+                          <a:off x="0" y="0"/>
+                          <a:ext cx="1211580" cy="1059180"/>
+                        </a:xfrm>
+                        <a:prstGeom prst="bentConnector3">
+                          <a:avLst>
+                            <a:gd name="adj1" fmla="val 50000"/>
+                          </a:avLst>
+                        </a:prstGeom>
+                        <a:noFill/>
+                        <a:ln w="9525">
+                          <a:solidFill>
+                            <a:srgbClr val="000000"/>
+                          </a:solidFill>
+                          <a:miter lim="800000"/>
+                          <a:headEnd type="none" w="med" len="med"/>
+                          <a:tailEnd type="triangle" w="med" len="med"/>
+                        </a:ln>
+                      </wps:spPr>
+                      <wps:bodyPr/>
+                    </wps:wsp>
+                  </a:graphicData>
+                </a:graphic>
+                <wp14:sizeRelH relativeFrom="page">
+                  <wp14:pctWidth>0</wp14:pctWidth>
+                </wp14:sizeRelH>
+                <wp14:sizeRelV relativeFrom="page">
+                  <wp14:pctHeight>0</wp14:pctHeight>
+                </wp14:sizeRelV>
+              </wp:anchor>
+            </w:drawing>
+          </mc:Choice>
+          <mc:Fallback>
+            <w:pict>
+              <v:shapetype w14:anchorId="4549C0C1" id="_x0000_t34" coordsize="21600,21600" o:spt="34" o:oned="t" adj="10800" path="m,l@0,0@0,21600,21600,21600e" filled="f">
+                <v:stroke joinstyle="miter"/>
+                <v:formulas>
+                  <v:f eqn="val #0"/>
+                </v:formulas>
+                <v:path arrowok="t" fillok="f" o:connecttype="none"/>
+                <v:handles>
+                  <v:h position="#0,center"/>
+                </v:handles>
+                <o:lock v:ext="edit" shapetype="t"/>
+              </v:shapetype>
+              <v:shape id="Connector: Elbow 11" o:spid="_x0000_s1026" type="#_x0000_t34" style="position:absolute;margin-left:218.75pt;margin-top:2.7pt;width:95.4pt;height:83.4pt;rotation:90;z-index:251663360;visibility:visible;mso-wrap-style:square;mso-width-percent:0;mso-height-percent:0;mso-wrap-distance-left:9pt;mso-wrap-distance-top:0;mso-wrap-distance-right:9pt;mso-wrap-distance-bottom:0;mso-position-horizontal:absolute;mso-position-horizontal-relative:text;mso-position-vertical:absolute;mso-position-vertical-relative:text;mso-width-percent:0;mso-height-percent:0;mso-width-relative:page;mso-height-relative:page" o:gfxdata="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">
+                <v:stroke endarrow="block"/>
+              </v:shape>
+            </w:pict>
+          </mc:Fallback>
+        </mc:AlternateContent>
+      </w:r>
     </w:p>
     <w:p>
       <w:pPr>
@@ -1075,7 +1128,7 @@
           </mc:Choice>
           <mc:Fallback>
             <w:pict>
-              <v:shape w14:anchorId="75AD938D" id="Cylinder 7" o:spid="_x0000_s1027" type="#_x0000_t22" style="position:absolute;left:0;text-align:left;margin-left:146.4pt;margin-top:18.05pt;width:85.8pt;height:87pt;z-index:251660288;visibility:visible;mso-wrap-style:square;mso-width-percent:0;mso-height-percent:0;mso-wrap-distance-left:9pt;mso-wrap-distance-top:0;mso-wrap-distance-right:9pt;mso-wrap-distance-bottom:0;mso-position-horizontal:absolute;mso-position-horizontal-relative:text;mso-position-vertical:absolute;mso-position-vertical-relative:text;mso-width-percent:0;mso-height-percent:0;mso-width-relative:page;mso-height-relative:page;v-text-anchor:top" o:gfxdata="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">
+              <v:shape w14:anchorId="75AD938D" id="Cylinder 7" o:spid="_x0000_s1028" type="#_x0000_t22" style="position:absolute;left:0;text-align:left;margin-left:146.4pt;margin-top:18.05pt;width:85.8pt;height:87pt;z-index:251660288;visibility:visible;mso-wrap-style:square;mso-width-percent:0;mso-height-percent:0;mso-wrap-distance-left:9pt;mso-wrap-distance-top:0;mso-wrap-distance-right:9pt;mso-wrap-distance-bottom:0;mso-position-horizontal:absolute;mso-position-horizontal-relative:text;mso-position-vertical:absolute;mso-position-vertical-relative:text;mso-width-percent:0;mso-height-percent:0;mso-width-relative:page;mso-height-relative:page;v-text-anchor:top" o:gfxdata="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">
                 <v:textbox>
                   <w:txbxContent>
                     <w:p>

</xml_diff>